<commit_message>
Docs: database CI passed for S4 and S5
Co-Authored-By: Claude Opus 5.5 <noreply@anthropic.com>
Claude-Session: https://claude.ai/code/session_012HHcRrzuvMBTL2FYxXtsyv
</commit_message>
<xml_diff>
--- a/treasury-platform/docs/49-PHASE2-S4-BUILD.docx
+++ b/treasury-platform/docs/49-PHASE2-S4-BUILD.docx
@@ -5137,7 +5137,31 @@
           <w:szCs w:val="21"/>
           <w:rtl/>
         </w:rPr>
-        <w:t xml:space="preserve"> نجح كله (2026-10-25) على الإيداع الذي يحمل S4 وS5 معًا: 165 اختبار وحدة، واختبار المتصفح بمقطعي S4 وS5، و121 اختبار تكامل على قاعدة منشورة. ونتيجة فحص القاعدة في ملحق DOC-B02.</w:t>
+        <w:t xml:space="preserve"> نجح كله (2026-10-25) على الإيداع الذي يحمل S4 وS5 معًا: 165 اختبار وحدة، واختبار المتصفح بمقطعي S4 وS5، و121 اختبار تكامل على قاعدة منشورة. ونجح فحص قاعدة البيانات (</w:t>
+      </w:r>
+      <w:r>
+        <w:rPr>
+          <w:rFonts w:ascii="Courier New" w:cs="Courier New" w:eastAsia="Courier New" w:hAnsi="Courier New"/>
+          <w:b w:val="false"/>
+          <w:bCs w:val="false"/>
+          <w:color w:val="1F2937"/>
+          <w:sz w:val="18"/>
+          <w:szCs w:val="18"/>
+          <w:shd w:fill="F1F3F5" w:color="auto" w:val="clear"/>
+          <w:rtl/>
+        </w:rPr>
+        <w:t xml:space="preserve">‎tools/ci/db_ci.sh‎</w:t>
+      </w:r>
+      <w:r>
+        <w:rPr>
+          <w:rFonts w:ascii="Arial" w:cs="Arial" w:eastAsia="Arial" w:hAnsi="Arial"/>
+          <w:b w:val="false"/>
+          <w:bCs w:val="false"/>
+          <w:sz w:val="21"/>
+          <w:szCs w:val="21"/>
+          <w:rtl/>
+        </w:rPr>
+        <w:t xml:space="preserve">) كله على f56d1f7، ومنه الإعدادات الأربعة والأربعون والبذر الآمن عند إعادة تشغيله.</w:t>
       </w:r>
     </w:p>
     <w:p>

</xml_diff>